<commit_message>
Android Studio, SDK, emuladores Hecho
</commit_message>
<xml_diff>
--- a/La memoria del Proyecto Intermodular_GeorgiiSytnik.docx
+++ b/La memoria del Proyecto Intermodular_GeorgiiSytnik.docx
@@ -4,452 +4,852 @@
   <w:body>
     <w:sdt>
       <w:sdtPr>
-        <w:id w:val="-1952471108"/>
+        <w:rPr>
+          <w:rFonts w:eastAsiaTheme="minorHAnsi"/>
+          <w:sz w:val="2"/>
+          <w:lang w:eastAsia="en-US"/>
+        </w:rPr>
+        <w:id w:val="-1552140010"/>
         <w:docPartObj>
           <w:docPartGallery w:val="Cover Pages"/>
           <w:docPartUnique/>
         </w:docPartObj>
       </w:sdtPr>
+      <w:sdtEndPr>
+        <w:rPr>
+          <w:sz w:val="24"/>
+        </w:rPr>
+      </w:sdtEndPr>
       <w:sdtContent>
         <w:p>
           <w:pPr>
-            <w:tabs>
-              <w:tab w:val="left" w:pos="3735"/>
-              <w:tab w:val="left" w:pos="7065"/>
-              <w:tab w:val="left" w:pos="7635"/>
-              <w:tab w:val="right" w:pos="8504"/>
-            </w:tabs>
-            <w:jc w:val="right"/>
+            <w:pStyle w:val="Sinespaciado"/>
             <w:rPr>
-              <w:color w:val="FFFFFF" w:themeColor="background1"/>
-              <w:sz w:val="36"/>
-              <w:szCs w:val="36"/>
+              <w:sz w:val="2"/>
             </w:rPr>
           </w:pPr>
+        </w:p>
+        <w:p>
           <w:r>
             <w:rPr>
               <w:noProof/>
-              <w:color w:val="FFFFFF" w:themeColor="background1"/>
+            </w:rPr>
+            <mc:AlternateContent>
+              <mc:Choice Requires="wps">
+                <w:drawing>
+                  <wp:anchor distT="0" distB="0" distL="114300" distR="114300" simplePos="0" relativeHeight="251661312" behindDoc="0" locked="0" layoutInCell="1" allowOverlap="1" wp14:anchorId="3BCC9463" wp14:editId="32655D54">
+                    <wp:simplePos x="0" y="0"/>
+                    <wp:positionH relativeFrom="page">
+                      <wp:align>center</wp:align>
+                    </wp:positionH>
+                    <wp:positionV relativeFrom="margin">
+                      <wp:align>top</wp:align>
+                    </wp:positionV>
+                    <wp:extent cx="5943600" cy="914400"/>
+                    <wp:effectExtent l="0" t="0" r="0" b="3810"/>
+                    <wp:wrapNone/>
+                    <wp:docPr id="62" name="Cuadro de texto 62"/>
+                    <wp:cNvGraphicFramePr/>
+                    <a:graphic xmlns:a="http://schemas.openxmlformats.org/drawingml/2006/main">
+                      <a:graphicData uri="http://schemas.microsoft.com/office/word/2010/wordprocessingShape">
+                        <wps:wsp>
+                          <wps:cNvSpPr txBox="1"/>
+                          <wps:spPr>
+                            <a:xfrm>
+                              <a:off x="0" y="0"/>
+                              <a:ext cx="5943600" cy="914400"/>
+                            </a:xfrm>
+                            <a:prstGeom prst="rect">
+                              <a:avLst/>
+                            </a:prstGeom>
+                            <a:noFill/>
+                            <a:ln w="6350">
+                              <a:noFill/>
+                            </a:ln>
+                            <a:effectLst/>
+                          </wps:spPr>
+                          <wps:style>
+                            <a:lnRef idx="0">
+                              <a:schemeClr val="accent1"/>
+                            </a:lnRef>
+                            <a:fillRef idx="0">
+                              <a:schemeClr val="accent1"/>
+                            </a:fillRef>
+                            <a:effectRef idx="0">
+                              <a:schemeClr val="accent1"/>
+                            </a:effectRef>
+                            <a:fontRef idx="minor">
+                              <a:schemeClr val="dk1"/>
+                            </a:fontRef>
+                          </wps:style>
+                          <wps:txbx>
+                            <w:txbxContent>
+                              <w:sdt>
+                                <w:sdtPr>
+                                  <w:rPr>
+                                    <w:rFonts w:asciiTheme="majorHAnsi" w:eastAsiaTheme="majorEastAsia" w:hAnsiTheme="majorHAnsi" w:cstheme="majorBidi"/>
+                                    <w:caps/>
+                                    <w:color w:val="4472C4" w:themeColor="accent1"/>
+                                    <w:sz w:val="72"/>
+                                    <w:szCs w:val="72"/>
+                                  </w:rPr>
+                                  <w:alias w:val="Título"/>
+                                  <w:tag w:val=""/>
+                                  <w:id w:val="797192764"/>
+                                  <w:dataBinding w:prefixMappings="xmlns:ns0='http://purl.org/dc/elements/1.1/' xmlns:ns1='http://schemas.openxmlformats.org/package/2006/metadata/core-properties' " w:xpath="/ns1:coreProperties[1]/ns0:title[1]" w:storeItemID="{6C3C8BC8-F283-45AE-878A-BAB7291924A1}"/>
+                                  <w:text/>
+                                </w:sdtPr>
+                                <w:sdtEndPr/>
+                                <w:sdtContent>
+                                  <w:p>
+                                    <w:pPr>
+                                      <w:pStyle w:val="Sinespaciado"/>
+                                      <w:jc w:val="center"/>
+                                      <w:rPr>
+                                        <w:rFonts w:asciiTheme="majorHAnsi" w:eastAsiaTheme="majorEastAsia" w:hAnsiTheme="majorHAnsi" w:cstheme="majorBidi"/>
+                                        <w:caps/>
+                                        <w:color w:val="8496B0" w:themeColor="text2" w:themeTint="99"/>
+                                        <w:sz w:val="68"/>
+                                        <w:szCs w:val="68"/>
+                                      </w:rPr>
+                                    </w:pPr>
+                                    <w:r>
+                                      <w:rPr>
+                                        <w:rFonts w:asciiTheme="majorHAnsi" w:eastAsiaTheme="majorEastAsia" w:hAnsiTheme="majorHAnsi" w:cstheme="majorBidi"/>
+                                        <w:caps/>
+                                        <w:color w:val="4472C4" w:themeColor="accent1"/>
+                                        <w:sz w:val="72"/>
+                                        <w:szCs w:val="72"/>
+                                      </w:rPr>
+                                      <w:t>MEMORIA DEL PROYECTO</w:t>
+                                    </w:r>
+                                    <w:r>
+                                      <w:rPr>
+                                        <w:rFonts w:asciiTheme="majorHAnsi" w:eastAsiaTheme="majorEastAsia" w:hAnsiTheme="majorHAnsi" w:cstheme="majorBidi"/>
+                                        <w:caps/>
+                                        <w:color w:val="4472C4" w:themeColor="accent1"/>
+                                        <w:sz w:val="72"/>
+                                        <w:szCs w:val="72"/>
+                                      </w:rPr>
+                                      <w:t xml:space="preserve"> </w:t>
+                                    </w:r>
+                                    <w:r>
+                                      <w:rPr>
+                                        <w:rFonts w:asciiTheme="majorHAnsi" w:eastAsiaTheme="majorEastAsia" w:hAnsiTheme="majorHAnsi" w:cstheme="majorBidi"/>
+                                        <w:caps/>
+                                        <w:color w:val="4472C4" w:themeColor="accent1"/>
+                                        <w:sz w:val="72"/>
+                                        <w:szCs w:val="72"/>
+                                      </w:rPr>
+                                      <w:t>THOTH TASKS</w:t>
+                                    </w:r>
+                                  </w:p>
+                                </w:sdtContent>
+                              </w:sdt>
+                              <w:p>
+                                <w:pPr>
+                                  <w:pStyle w:val="Sinespaciado"/>
+                                  <w:spacing w:before="120"/>
+                                  <w:rPr>
+                                    <w:color w:val="4472C4" w:themeColor="accent1"/>
+                                    <w:sz w:val="36"/>
+                                    <w:szCs w:val="36"/>
+                                  </w:rPr>
+                                </w:pPr>
+                                <w:sdt>
+                                  <w:sdtPr>
+                                    <w:rPr>
+                                      <w:color w:val="4472C4" w:themeColor="accent1"/>
+                                      <w:sz w:val="36"/>
+                                      <w:szCs w:val="36"/>
+                                    </w:rPr>
+                                    <w:alias w:val="Subtítulo"/>
+                                    <w:tag w:val=""/>
+                                    <w:id w:val="2021743002"/>
+                                    <w:dataBinding w:prefixMappings="xmlns:ns0='http://purl.org/dc/elements/1.1/' xmlns:ns1='http://schemas.openxmlformats.org/package/2006/metadata/core-properties' " w:xpath="/ns1:coreProperties[1]/ns0:subject[1]" w:storeItemID="{6C3C8BC8-F283-45AE-878A-BAB7291924A1}"/>
+                                    <w:text/>
+                                  </w:sdtPr>
+                                  <w:sdtEndPr/>
+                                  <w:sdtContent>
+                                    <w:r>
+                                      <w:rPr>
+                                        <w:color w:val="4472C4" w:themeColor="accent1"/>
+                                        <w:sz w:val="36"/>
+                                        <w:szCs w:val="36"/>
+                                      </w:rPr>
+                                      <w:t>PROYECTO INTERMODULAR</w:t>
+                                    </w:r>
+                                  </w:sdtContent>
+                                </w:sdt>
+                                <w:r>
+                                  <w:t xml:space="preserve"> </w:t>
+                                </w:r>
+                              </w:p>
+                              <w:p/>
+                            </w:txbxContent>
+                          </wps:txbx>
+                          <wps:bodyPr rot="0" spcFirstLastPara="0" vertOverflow="overflow" horzOverflow="overflow" vert="horz" wrap="square" lIns="91440" tIns="45720" rIns="91440" bIns="45720" numCol="1" spcCol="0" rtlCol="0" fromWordArt="0" anchor="t" anchorCtr="0" forceAA="0" compatLnSpc="1">
+                            <a:prstTxWarp prst="textNoShape">
+                              <a:avLst/>
+                            </a:prstTxWarp>
+                            <a:spAutoFit/>
+                          </wps:bodyPr>
+                        </wps:wsp>
+                      </a:graphicData>
+                    </a:graphic>
+                    <wp14:sizeRelH relativeFrom="page">
+                      <wp14:pctWidth>76500</wp14:pctWidth>
+                    </wp14:sizeRelH>
+                  </wp:anchor>
+                </w:drawing>
+              </mc:Choice>
+              <mc:Fallback>
+                <w:pict>
+                  <v:shapetype w14:anchorId="3BCC9463" id="_x0000_t202" coordsize="21600,21600" o:spt="202" path="m,l,21600r21600,l21600,xe">
+                    <v:stroke joinstyle="miter"/>
+                    <v:path gradientshapeok="t" o:connecttype="rect"/>
+                  </v:shapetype>
+                  <v:shape id="Cuadro de texto 62" o:spid="_x0000_s1026" type="#_x0000_t202" style="position:absolute;left:0;text-align:left;margin-left:0;margin-top:0;width:468pt;height:1in;z-index:251661312;visibility:visible;mso-wrap-style:square;mso-width-percent:765;mso-wrap-distance-left:9pt;mso-wrap-distance-top:0;mso-wrap-distance-right:9pt;mso-wrap-distance-bottom:0;mso-position-horizontal:center;mso-position-horizontal-relative:page;mso-position-vertical:top;mso-position-vertical-relative:margin;mso-width-percent:765;mso-width-relative:page;v-text-anchor:top" o:gfxdata="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" filled="f" stroked="f" strokeweight=".5pt">
+                    <v:textbox style="mso-fit-shape-to-text:t">
+                      <w:txbxContent>
+                        <w:sdt>
+                          <w:sdtPr>
+                            <w:rPr>
+                              <w:rFonts w:asciiTheme="majorHAnsi" w:eastAsiaTheme="majorEastAsia" w:hAnsiTheme="majorHAnsi" w:cstheme="majorBidi"/>
+                              <w:caps/>
+                              <w:color w:val="4472C4" w:themeColor="accent1"/>
+                              <w:sz w:val="72"/>
+                              <w:szCs w:val="72"/>
+                            </w:rPr>
+                            <w:alias w:val="Título"/>
+                            <w:tag w:val=""/>
+                            <w:id w:val="797192764"/>
+                            <w:dataBinding w:prefixMappings="xmlns:ns0='http://purl.org/dc/elements/1.1/' xmlns:ns1='http://schemas.openxmlformats.org/package/2006/metadata/core-properties' " w:xpath="/ns1:coreProperties[1]/ns0:title[1]" w:storeItemID="{6C3C8BC8-F283-45AE-878A-BAB7291924A1}"/>
+                            <w:text/>
+                          </w:sdtPr>
+                          <w:sdtEndPr/>
+                          <w:sdtContent>
+                            <w:p>
+                              <w:pPr>
+                                <w:pStyle w:val="Sinespaciado"/>
+                                <w:jc w:val="center"/>
+                                <w:rPr>
+                                  <w:rFonts w:asciiTheme="majorHAnsi" w:eastAsiaTheme="majorEastAsia" w:hAnsiTheme="majorHAnsi" w:cstheme="majorBidi"/>
+                                  <w:caps/>
+                                  <w:color w:val="8496B0" w:themeColor="text2" w:themeTint="99"/>
+                                  <w:sz w:val="68"/>
+                                  <w:szCs w:val="68"/>
+                                </w:rPr>
+                              </w:pPr>
+                              <w:r>
+                                <w:rPr>
+                                  <w:rFonts w:asciiTheme="majorHAnsi" w:eastAsiaTheme="majorEastAsia" w:hAnsiTheme="majorHAnsi" w:cstheme="majorBidi"/>
+                                  <w:caps/>
+                                  <w:color w:val="4472C4" w:themeColor="accent1"/>
+                                  <w:sz w:val="72"/>
+                                  <w:szCs w:val="72"/>
+                                </w:rPr>
+                                <w:t>MEMORIA DEL PROYECTO</w:t>
+                              </w:r>
+                              <w:r>
+                                <w:rPr>
+                                  <w:rFonts w:asciiTheme="majorHAnsi" w:eastAsiaTheme="majorEastAsia" w:hAnsiTheme="majorHAnsi" w:cstheme="majorBidi"/>
+                                  <w:caps/>
+                                  <w:color w:val="4472C4" w:themeColor="accent1"/>
+                                  <w:sz w:val="72"/>
+                                  <w:szCs w:val="72"/>
+                                </w:rPr>
+                                <w:t xml:space="preserve"> </w:t>
+                              </w:r>
+                              <w:r>
+                                <w:rPr>
+                                  <w:rFonts w:asciiTheme="majorHAnsi" w:eastAsiaTheme="majorEastAsia" w:hAnsiTheme="majorHAnsi" w:cstheme="majorBidi"/>
+                                  <w:caps/>
+                                  <w:color w:val="4472C4" w:themeColor="accent1"/>
+                                  <w:sz w:val="72"/>
+                                  <w:szCs w:val="72"/>
+                                </w:rPr>
+                                <w:t>THOTH TASKS</w:t>
+                              </w:r>
+                            </w:p>
+                          </w:sdtContent>
+                        </w:sdt>
+                        <w:p>
+                          <w:pPr>
+                            <w:pStyle w:val="Sinespaciado"/>
+                            <w:spacing w:before="120"/>
+                            <w:rPr>
+                              <w:color w:val="4472C4" w:themeColor="accent1"/>
+                              <w:sz w:val="36"/>
+                              <w:szCs w:val="36"/>
+                            </w:rPr>
+                          </w:pPr>
+                          <w:sdt>
+                            <w:sdtPr>
+                              <w:rPr>
+                                <w:color w:val="4472C4" w:themeColor="accent1"/>
+                                <w:sz w:val="36"/>
+                                <w:szCs w:val="36"/>
+                              </w:rPr>
+                              <w:alias w:val="Subtítulo"/>
+                              <w:tag w:val=""/>
+                              <w:id w:val="2021743002"/>
+                              <w:dataBinding w:prefixMappings="xmlns:ns0='http://purl.org/dc/elements/1.1/' xmlns:ns1='http://schemas.openxmlformats.org/package/2006/metadata/core-properties' " w:xpath="/ns1:coreProperties[1]/ns0:subject[1]" w:storeItemID="{6C3C8BC8-F283-45AE-878A-BAB7291924A1}"/>
+                              <w:text/>
+                            </w:sdtPr>
+                            <w:sdtEndPr/>
+                            <w:sdtContent>
+                              <w:r>
+                                <w:rPr>
+                                  <w:color w:val="4472C4" w:themeColor="accent1"/>
+                                  <w:sz w:val="36"/>
+                                  <w:szCs w:val="36"/>
+                                </w:rPr>
+                                <w:t>PROYECTO INTERMODULAR</w:t>
+                              </w:r>
+                            </w:sdtContent>
+                          </w:sdt>
+                          <w:r>
+                            <w:t xml:space="preserve"> </w:t>
+                          </w:r>
+                        </w:p>
+                        <w:p/>
+                      </w:txbxContent>
+                    </v:textbox>
+                    <w10:wrap anchorx="page" anchory="margin"/>
+                  </v:shape>
+                </w:pict>
+              </mc:Fallback>
+            </mc:AlternateContent>
+          </w:r>
+          <w:r>
+            <w:rPr>
+              <w:noProof/>
+              <w:color w:val="4472C4" w:themeColor="accent1"/>
               <w:sz w:val="36"/>
               <w:szCs w:val="36"/>
             </w:rPr>
             <mc:AlternateContent>
               <mc:Choice Requires="wpg">
                 <w:drawing>
-                  <wp:anchor distT="0" distB="0" distL="114300" distR="114300" simplePos="0" relativeHeight="251659264" behindDoc="1" locked="0" layoutInCell="1" allowOverlap="1" wp14:anchorId="23990EAD" wp14:editId="72077297">
+                  <wp:anchor distT="0" distB="0" distL="114300" distR="114300" simplePos="0" relativeHeight="251660288" behindDoc="1" locked="0" layoutInCell="1" allowOverlap="1" wp14:anchorId="75BA1E4D" wp14:editId="0029786C">
                     <wp:simplePos x="0" y="0"/>
-                    <wp:positionH relativeFrom="page">
-                      <wp:align>center</wp:align>
-                    </wp:positionH>
-                    <wp:positionV relativeFrom="page">
-                      <wp:align>center</wp:align>
-                    </wp:positionV>
-                    <wp:extent cx="6864824" cy="9123528"/>
-                    <wp:effectExtent l="0" t="0" r="2540" b="635"/>
+                    <mc:AlternateContent>
+                      <mc:Choice Requires="wp14">
+                        <wp:positionH relativeFrom="page">
+                          <wp14:pctPosHOffset>22000</wp14:pctPosHOffset>
+                        </wp:positionH>
+                      </mc:Choice>
+                      <mc:Fallback>
+                        <wp:positionH relativeFrom="page">
+                          <wp:posOffset>1663065</wp:posOffset>
+                        </wp:positionH>
+                      </mc:Fallback>
+                    </mc:AlternateContent>
+                    <mc:AlternateContent>
+                      <mc:Choice Requires="wp14">
+                        <wp:positionV relativeFrom="page">
+                          <wp14:pctPosVOffset>30000</wp14:pctPosVOffset>
+                        </wp:positionV>
+                      </mc:Choice>
+                      <mc:Fallback>
+                        <wp:positionV relativeFrom="page">
+                          <wp:posOffset>3207385</wp:posOffset>
+                        </wp:positionV>
+                      </mc:Fallback>
+                    </mc:AlternateContent>
+                    <wp:extent cx="5494369" cy="5696712"/>
+                    <wp:effectExtent l="0" t="0" r="0" b="3175"/>
                     <wp:wrapNone/>
-                    <wp:docPr id="193" name="Grupo 193"/>
-                    <wp:cNvGraphicFramePr/>
+                    <wp:docPr id="63" name="Grupo 2"/>
+                    <wp:cNvGraphicFramePr>
+                      <a:graphicFrameLocks xmlns:a="http://schemas.openxmlformats.org/drawingml/2006/main" noChangeAspect="1"/>
+                    </wp:cNvGraphicFramePr>
                     <a:graphic xmlns:a="http://schemas.openxmlformats.org/drawingml/2006/main">
                       <a:graphicData uri="http://schemas.microsoft.com/office/word/2010/wordprocessingGroup">
                         <wpg:wgp>
-                          <wpg:cNvGrpSpPr/>
+                          <wpg:cNvGrpSpPr>
+                            <a:grpSpLocks noChangeAspect="1"/>
+                          </wpg:cNvGrpSpPr>
                           <wpg:grpSpPr>
                             <a:xfrm>
                               <a:off x="0" y="0"/>
-                              <a:ext cx="6864824" cy="9123528"/>
+                              <a:ext cx="5494369" cy="5696712"/>
                               <a:chOff x="0" y="0"/>
-                              <a:chExt cx="6864824" cy="9123528"/>
+                              <a:chExt cx="4329113" cy="4491038"/>
                             </a:xfrm>
+                            <a:solidFill>
+                              <a:schemeClr val="tx2">
+                                <a:lumMod val="60000"/>
+                                <a:lumOff val="40000"/>
+                              </a:schemeClr>
+                            </a:solidFill>
                           </wpg:grpSpPr>
                           <wps:wsp>
-                            <wps:cNvPr id="194" name="Rectángulo 194"/>
-                            <wps:cNvSpPr/>
-                            <wps:spPr>
+                            <wps:cNvPr id="64" name="Forma libre 64"/>
+                            <wps:cNvSpPr>
+                              <a:spLocks/>
+                            </wps:cNvSpPr>
+                            <wps:spPr bwMode="auto">
                               <a:xfrm>
-                                <a:off x="0" y="0"/>
-                                <a:ext cx="6858000" cy="1371600"/>
+                                <a:off x="1501775" y="0"/>
+                                <a:ext cx="2827338" cy="2835275"/>
                               </a:xfrm>
-                              <a:prstGeom prst="rect">
+                              <a:custGeom>
                                 <a:avLst/>
-                              </a:prstGeom>
-                              <a:solidFill>
-                                <a:schemeClr val="accent1"/>
-                              </a:solidFill>
+                                <a:gdLst>
+                                  <a:gd name="T0" fmla="*/ 4 w 1781"/>
+                                  <a:gd name="T1" fmla="*/ 1786 h 1786"/>
+                                  <a:gd name="T2" fmla="*/ 0 w 1781"/>
+                                  <a:gd name="T3" fmla="*/ 1782 h 1786"/>
+                                  <a:gd name="T4" fmla="*/ 1776 w 1781"/>
+                                  <a:gd name="T5" fmla="*/ 0 h 1786"/>
+                                  <a:gd name="T6" fmla="*/ 1781 w 1781"/>
+                                  <a:gd name="T7" fmla="*/ 5 h 1786"/>
+                                  <a:gd name="T8" fmla="*/ 4 w 1781"/>
+                                  <a:gd name="T9" fmla="*/ 1786 h 1786"/>
+                                </a:gdLst>
+                                <a:ahLst/>
+                                <a:cxnLst>
+                                  <a:cxn ang="0">
+                                    <a:pos x="T0" y="T1"/>
+                                  </a:cxn>
+                                  <a:cxn ang="0">
+                                    <a:pos x="T2" y="T3"/>
+                                  </a:cxn>
+                                  <a:cxn ang="0">
+                                    <a:pos x="T4" y="T5"/>
+                                  </a:cxn>
+                                  <a:cxn ang="0">
+                                    <a:pos x="T6" y="T7"/>
+                                  </a:cxn>
+                                  <a:cxn ang="0">
+                                    <a:pos x="T8" y="T9"/>
+                                  </a:cxn>
+                                </a:cxnLst>
+                                <a:rect l="0" t="0" r="r" b="b"/>
+                                <a:pathLst>
+                                  <a:path w="1781" h="1786">
+                                    <a:moveTo>
+                                      <a:pt x="4" y="1786"/>
+                                    </a:moveTo>
+                                    <a:lnTo>
+                                      <a:pt x="0" y="1782"/>
+                                    </a:lnTo>
+                                    <a:lnTo>
+                                      <a:pt x="1776" y="0"/>
+                                    </a:lnTo>
+                                    <a:lnTo>
+                                      <a:pt x="1781" y="5"/>
+                                    </a:lnTo>
+                                    <a:lnTo>
+                                      <a:pt x="4" y="1786"/>
+                                    </a:lnTo>
+                                    <a:close/>
+                                  </a:path>
+                                </a:pathLst>
+                              </a:custGeom>
+                              <a:grpFill/>
                               <a:ln>
                                 <a:noFill/>
                               </a:ln>
+                              <a:extLst>
+                                <a:ext uri="{91240B29-F687-4F45-9708-019B960494DF}">
+                                  <a14:hiddenLine xmlns:a14="http://schemas.microsoft.com/office/drawing/2010/main" w="9525">
+                                    <a:solidFill>
+                                      <a:srgbClr val="000000"/>
+                                    </a:solidFill>
+                                    <a:round/>
+                                    <a:headEnd/>
+                                    <a:tailEnd/>
+                                  </a14:hiddenLine>
+                                </a:ext>
+                              </a:extLst>
                             </wps:spPr>
-                            <wps:style>
-                              <a:lnRef idx="2">
-                                <a:schemeClr val="accent1">
-                                  <a:shade val="50000"/>
-                                </a:schemeClr>
-                              </a:lnRef>
-                              <a:fillRef idx="1">
-                                <a:schemeClr val="accent1"/>
-                              </a:fillRef>
-                              <a:effectRef idx="0">
-                                <a:schemeClr val="accent1"/>
-                              </a:effectRef>
-                              <a:fontRef idx="minor">
-                                <a:schemeClr val="lt1"/>
-                              </a:fontRef>
-                            </wps:style>
-                            <wps:bodyPr rot="0" spcFirstLastPara="0" vertOverflow="overflow" horzOverflow="overflow" vert="horz" wrap="square" lIns="91440" tIns="45720" rIns="91440" bIns="45720" numCol="1" spcCol="0" rtlCol="0" fromWordArt="0" anchor="ctr" anchorCtr="0" forceAA="0" compatLnSpc="1">
+                            <wps:bodyPr vert="horz" wrap="square" lIns="91440" tIns="45720" rIns="91440" bIns="45720" numCol="1" anchor="t" anchorCtr="0" compatLnSpc="1">
                               <a:prstTxWarp prst="textNoShape">
                                 <a:avLst/>
                               </a:prstTxWarp>
-                              <a:noAutofit/>
                             </wps:bodyPr>
                           </wps:wsp>
                           <wps:wsp>
-                            <wps:cNvPr id="195" name="Rectángulo 195"/>
-                            <wps:cNvSpPr/>
-                            <wps:spPr>
+                            <wps:cNvPr id="65" name="Forma libre 65"/>
+                            <wps:cNvSpPr>
+                              <a:spLocks/>
+                            </wps:cNvSpPr>
+                            <wps:spPr bwMode="auto">
                               <a:xfrm>
-                                <a:off x="0" y="4094328"/>
-                                <a:ext cx="6858000" cy="5029200"/>
+                                <a:off x="782637" y="227013"/>
+                                <a:ext cx="3546475" cy="3546475"/>
                               </a:xfrm>
-                              <a:prstGeom prst="rect">
+                              <a:custGeom>
                                 <a:avLst/>
-                              </a:prstGeom>
-                              <a:solidFill>
-                                <a:schemeClr val="accent1"/>
-                              </a:solidFill>
+                                <a:gdLst>
+                                  <a:gd name="T0" fmla="*/ 5 w 2234"/>
+                                  <a:gd name="T1" fmla="*/ 2234 h 2234"/>
+                                  <a:gd name="T2" fmla="*/ 0 w 2234"/>
+                                  <a:gd name="T3" fmla="*/ 2229 h 2234"/>
+                                  <a:gd name="T4" fmla="*/ 2229 w 2234"/>
+                                  <a:gd name="T5" fmla="*/ 0 h 2234"/>
+                                  <a:gd name="T6" fmla="*/ 2234 w 2234"/>
+                                  <a:gd name="T7" fmla="*/ 5 h 2234"/>
+                                  <a:gd name="T8" fmla="*/ 5 w 2234"/>
+                                  <a:gd name="T9" fmla="*/ 2234 h 2234"/>
+                                </a:gdLst>
+                                <a:ahLst/>
+                                <a:cxnLst>
+                                  <a:cxn ang="0">
+                                    <a:pos x="T0" y="T1"/>
+                                  </a:cxn>
+                                  <a:cxn ang="0">
+                                    <a:pos x="T2" y="T3"/>
+                                  </a:cxn>
+                                  <a:cxn ang="0">
+                                    <a:pos x="T4" y="T5"/>
+                                  </a:cxn>
+                                  <a:cxn ang="0">
+                                    <a:pos x="T6" y="T7"/>
+                                  </a:cxn>
+                                  <a:cxn ang="0">
+                                    <a:pos x="T8" y="T9"/>
+                                  </a:cxn>
+                                </a:cxnLst>
+                                <a:rect l="0" t="0" r="r" b="b"/>
+                                <a:pathLst>
+                                  <a:path w="2234" h="2234">
+                                    <a:moveTo>
+                                      <a:pt x="5" y="2234"/>
+                                    </a:moveTo>
+                                    <a:lnTo>
+                                      <a:pt x="0" y="2229"/>
+                                    </a:lnTo>
+                                    <a:lnTo>
+                                      <a:pt x="2229" y="0"/>
+                                    </a:lnTo>
+                                    <a:lnTo>
+                                      <a:pt x="2234" y="5"/>
+                                    </a:lnTo>
+                                    <a:lnTo>
+                                      <a:pt x="5" y="2234"/>
+                                    </a:lnTo>
+                                    <a:close/>
+                                  </a:path>
+                                </a:pathLst>
+                              </a:custGeom>
+                              <a:grpFill/>
                               <a:ln>
                                 <a:noFill/>
                               </a:ln>
+                              <a:extLst>
+                                <a:ext uri="{91240B29-F687-4F45-9708-019B960494DF}">
+                                  <a14:hiddenLine xmlns:a14="http://schemas.microsoft.com/office/drawing/2010/main" w="9525">
+                                    <a:solidFill>
+                                      <a:srgbClr val="000000"/>
+                                    </a:solidFill>
+                                    <a:round/>
+                                    <a:headEnd/>
+                                    <a:tailEnd/>
+                                  </a14:hiddenLine>
+                                </a:ext>
+                              </a:extLst>
                             </wps:spPr>
-                            <wps:style>
-                              <a:lnRef idx="2">
-                                <a:schemeClr val="accent1">
-                                  <a:shade val="50000"/>
-                                </a:schemeClr>
-                              </a:lnRef>
-                              <a:fillRef idx="1">
-                                <a:schemeClr val="accent1"/>
-                              </a:fillRef>
-                              <a:effectRef idx="0">
-                                <a:schemeClr val="accent1"/>
-                              </a:effectRef>
-                              <a:fontRef idx="minor">
-                                <a:schemeClr val="lt1"/>
-                              </a:fontRef>
-                            </wps:style>
-                            <wps:txbx>
-                              <w:txbxContent>
-                                <w:sdt>
-                                  <w:sdtPr>
-                                    <w:rPr>
-                                      <w:sz w:val="48"/>
-                                      <w:szCs w:val="48"/>
-                                    </w:rPr>
-                                    <w:alias w:val="Autor"/>
-                                    <w:tag w:val=""/>
-                                    <w:id w:val="945428907"/>
-                                    <w:dataBinding w:prefixMappings="xmlns:ns0='http://purl.org/dc/elements/1.1/' xmlns:ns1='http://schemas.openxmlformats.org/package/2006/metadata/core-properties' " w:xpath="/ns1:coreProperties[1]/ns0:creator[1]" w:storeItemID="{6C3C8BC8-F283-45AE-878A-BAB7291924A1}"/>
-                                    <w:text/>
-                                  </w:sdtPr>
-                                  <w:sdtContent>
-                                    <w:sdt>
-                                      <w:sdtPr>
-                                        <w:rPr>
-                                          <w:sz w:val="48"/>
-                                          <w:szCs w:val="48"/>
-                                        </w:rPr>
-                                        <w:alias w:val="Autor"/>
-                                        <w:tag w:val=""/>
-                                        <w:id w:val="-852960315"/>
-                                        <w:dataBinding w:prefixMappings="xmlns:ns0='http://purl.org/dc/elements/1.1/' xmlns:ns1='http://schemas.openxmlformats.org/package/2006/metadata/core-properties' " w:xpath="/ns1:coreProperties[1]/ns0:creator[1]" w:storeItemID="{6C3C8BC8-F283-45AE-878A-BAB7291924A1}"/>
-                                        <w:text/>
-                                      </w:sdtPr>
-                                      <w:sdtContent>
-                                        <w:p>
-                                          <w:pPr>
-                                            <w:jc w:val="right"/>
-                                            <w:rPr>
-                                              <w:sz w:val="48"/>
-                                              <w:szCs w:val="48"/>
-                                            </w:rPr>
-                                          </w:pPr>
-                                          <w:r>
-                                            <w:rPr>
-                                              <w:sz w:val="48"/>
-                                              <w:szCs w:val="48"/>
-                                            </w:rPr>
-                                            <w:t>Georgii Sytnik</w:t>
-                                          </w:r>
-                                        </w:p>
-                                      </w:sdtContent>
-                                    </w:sdt>
-                                  </w:sdtContent>
-                                </w:sdt>
-                              </w:txbxContent>
-                            </wps:txbx>
-                            <wps:bodyPr rot="0" spcFirstLastPara="0" vertOverflow="overflow" horzOverflow="overflow" vert="horz" wrap="square" lIns="457200" tIns="731520" rIns="457200" bIns="457200" numCol="1" spcCol="0" rtlCol="0" fromWordArt="0" anchor="b" anchorCtr="0" forceAA="0" compatLnSpc="1">
+                            <wps:bodyPr vert="horz" wrap="square" lIns="91440" tIns="45720" rIns="91440" bIns="45720" numCol="1" anchor="t" anchorCtr="0" compatLnSpc="1">
                               <a:prstTxWarp prst="textNoShape">
                                 <a:avLst/>
                               </a:prstTxWarp>
-                              <a:noAutofit/>
                             </wps:bodyPr>
                           </wps:wsp>
                           <wps:wsp>
-                            <wps:cNvPr id="196" name="Cuadro de texto 196"/>
-                            <wps:cNvSpPr txBox="1"/>
-                            <wps:spPr>
+                            <wps:cNvPr id="66" name="Forma libre 66"/>
+                            <wps:cNvSpPr>
+                              <a:spLocks/>
+                            </wps:cNvSpPr>
+                            <wps:spPr bwMode="auto">
                               <a:xfrm>
-                                <a:off x="6824" y="1371600"/>
-                                <a:ext cx="6858000" cy="2722728"/>
+                                <a:off x="841375" y="109538"/>
+                                <a:ext cx="3487738" cy="3487738"/>
                               </a:xfrm>
-                              <a:prstGeom prst="rect">
+                              <a:custGeom>
                                 <a:avLst/>
-                              </a:prstGeom>
-                              <a:solidFill>
-                                <a:schemeClr val="bg1"/>
-                              </a:solidFill>
-                              <a:ln w="6350">
+                                <a:gdLst>
+                                  <a:gd name="T0" fmla="*/ 9 w 2197"/>
+                                  <a:gd name="T1" fmla="*/ 2197 h 2197"/>
+                                  <a:gd name="T2" fmla="*/ 0 w 2197"/>
+                                  <a:gd name="T3" fmla="*/ 2193 h 2197"/>
+                                  <a:gd name="T4" fmla="*/ 2188 w 2197"/>
+                                  <a:gd name="T5" fmla="*/ 0 h 2197"/>
+                                  <a:gd name="T6" fmla="*/ 2197 w 2197"/>
+                                  <a:gd name="T7" fmla="*/ 10 h 2197"/>
+                                  <a:gd name="T8" fmla="*/ 9 w 2197"/>
+                                  <a:gd name="T9" fmla="*/ 2197 h 2197"/>
+                                </a:gdLst>
+                                <a:ahLst/>
+                                <a:cxnLst>
+                                  <a:cxn ang="0">
+                                    <a:pos x="T0" y="T1"/>
+                                  </a:cxn>
+                                  <a:cxn ang="0">
+                                    <a:pos x="T2" y="T3"/>
+                                  </a:cxn>
+                                  <a:cxn ang="0">
+                                    <a:pos x="T4" y="T5"/>
+                                  </a:cxn>
+                                  <a:cxn ang="0">
+                                    <a:pos x="T6" y="T7"/>
+                                  </a:cxn>
+                                  <a:cxn ang="0">
+                                    <a:pos x="T8" y="T9"/>
+                                  </a:cxn>
+                                </a:cxnLst>
+                                <a:rect l="0" t="0" r="r" b="b"/>
+                                <a:pathLst>
+                                  <a:path w="2197" h="2197">
+                                    <a:moveTo>
+                                      <a:pt x="9" y="2197"/>
+                                    </a:moveTo>
+                                    <a:lnTo>
+                                      <a:pt x="0" y="2193"/>
+                                    </a:lnTo>
+                                    <a:lnTo>
+                                      <a:pt x="2188" y="0"/>
+                                    </a:lnTo>
+                                    <a:lnTo>
+                                      <a:pt x="2197" y="10"/>
+                                    </a:lnTo>
+                                    <a:lnTo>
+                                      <a:pt x="9" y="2197"/>
+                                    </a:lnTo>
+                                    <a:close/>
+                                  </a:path>
+                                </a:pathLst>
+                              </a:custGeom>
+                              <a:grpFill/>
+                              <a:ln>
                                 <a:noFill/>
                               </a:ln>
-                              <a:effectLst/>
+                              <a:extLst>
+                                <a:ext uri="{91240B29-F687-4F45-9708-019B960494DF}">
+                                  <a14:hiddenLine xmlns:a14="http://schemas.microsoft.com/office/drawing/2010/main" w="9525">
+                                    <a:solidFill>
+                                      <a:srgbClr val="000000"/>
+                                    </a:solidFill>
+                                    <a:round/>
+                                    <a:headEnd/>
+                                    <a:tailEnd/>
+                                  </a14:hiddenLine>
+                                </a:ext>
+                              </a:extLst>
                             </wps:spPr>
-                            <wps:style>
-                              <a:lnRef idx="0">
-                                <a:schemeClr val="accent1"/>
-                              </a:lnRef>
-                              <a:fillRef idx="0">
-                                <a:schemeClr val="accent1"/>
-                              </a:fillRef>
-                              <a:effectRef idx="0">
-                                <a:schemeClr val="accent1"/>
-                              </a:effectRef>
-                              <a:fontRef idx="minor">
-                                <a:schemeClr val="dk1"/>
-                              </a:fontRef>
-                            </wps:style>
-                            <wps:txbx>
-                              <w:txbxContent>
-                                <w:p>
-                                  <w:pPr>
-                                    <w:pStyle w:val="Sinespaciado"/>
-                                    <w:jc w:val="center"/>
-                                    <w:rPr>
-                                      <w:rFonts w:asciiTheme="majorHAnsi" w:eastAsiaTheme="majorEastAsia" w:hAnsiTheme="majorHAnsi" w:cstheme="majorBidi"/>
-                                      <w:caps/>
-                                      <w:color w:val="4472C4" w:themeColor="accent1"/>
-                                      <w:sz w:val="72"/>
-                                      <w:szCs w:val="72"/>
-                                    </w:rPr>
-                                  </w:pPr>
-                                  <w:r>
-                                    <w:rPr>
-                                      <w:rFonts w:asciiTheme="majorHAnsi" w:eastAsiaTheme="majorEastAsia" w:hAnsiTheme="majorHAnsi" w:cstheme="majorBidi"/>
-                                      <w:caps/>
-                                      <w:color w:val="4472C4" w:themeColor="accent1"/>
-                                      <w:sz w:val="72"/>
-                                      <w:szCs w:val="72"/>
-                                    </w:rPr>
-                                    <w:t>Memoria del proyecto</w:t>
-                                  </w:r>
-                                  <w:r>
-                                    <w:rPr>
-                                      <w:rFonts w:asciiTheme="majorHAnsi" w:eastAsiaTheme="majorEastAsia" w:hAnsiTheme="majorHAnsi" w:cstheme="majorBidi"/>
-                                      <w:caps/>
-                                      <w:color w:val="4472C4" w:themeColor="accent1"/>
-                                      <w:sz w:val="72"/>
-                                      <w:szCs w:val="72"/>
-                                    </w:rPr>
-                                    <w:t>:</w:t>
-                                  </w:r>
-                                </w:p>
-                                <w:p>
-                                  <w:pPr>
-                                    <w:pStyle w:val="Sinespaciado"/>
-                                    <w:jc w:val="center"/>
-                                    <w:rPr>
-                                      <w:rFonts w:asciiTheme="majorHAnsi" w:eastAsiaTheme="majorEastAsia" w:hAnsiTheme="majorHAnsi" w:cstheme="majorBidi"/>
-                                      <w:caps/>
-                                      <w:color w:val="4472C4" w:themeColor="accent1"/>
-                                      <w:sz w:val="72"/>
-                                      <w:szCs w:val="72"/>
-                                    </w:rPr>
-                                  </w:pPr>
-                                  <w:r>
-                                    <w:rPr>
-                                      <w:rFonts w:asciiTheme="majorHAnsi" w:eastAsiaTheme="majorEastAsia" w:hAnsiTheme="majorHAnsi" w:cstheme="majorBidi"/>
-                                      <w:caps/>
-                                      <w:color w:val="4472C4" w:themeColor="accent1"/>
-                                      <w:sz w:val="72"/>
-                                      <w:szCs w:val="72"/>
-                                    </w:rPr>
-                                    <w:t xml:space="preserve">Thoth </w:t>
-                                  </w:r>
-                                  <w:bookmarkStart w:id="0" w:name="_GoBack"/>
-                                  <w:bookmarkEnd w:id="0"/>
-                                  <w:r>
-                                    <w:rPr>
-                                      <w:rFonts w:asciiTheme="majorHAnsi" w:eastAsiaTheme="majorEastAsia" w:hAnsiTheme="majorHAnsi" w:cstheme="majorBidi"/>
-                                      <w:caps/>
-                                      <w:color w:val="4472C4" w:themeColor="accent1"/>
-                                      <w:sz w:val="72"/>
-                                      <w:szCs w:val="72"/>
-                                    </w:rPr>
-                                    <w:t>tasks</w:t>
-                                  </w:r>
-                                </w:p>
-                              </w:txbxContent>
-                            </wps:txbx>
-                            <wps:bodyPr rot="0" spcFirstLastPara="0" vertOverflow="overflow" horzOverflow="overflow" vert="horz" wrap="square" lIns="457200" tIns="91440" rIns="457200" bIns="91440" numCol="1" spcCol="0" rtlCol="0" fromWordArt="0" anchor="ctr" anchorCtr="0" forceAA="0" compatLnSpc="1">
+                            <wps:bodyPr vert="horz" wrap="square" lIns="91440" tIns="45720" rIns="91440" bIns="45720" numCol="1" anchor="t" anchorCtr="0" compatLnSpc="1">
                               <a:prstTxWarp prst="textNoShape">
                                 <a:avLst/>
                               </a:prstTxWarp>
-                              <a:noAutofit/>
+                            </wps:bodyPr>
+                          </wps:wsp>
+                          <wps:wsp>
+                            <wps:cNvPr id="67" name="Forma libre 67"/>
+                            <wps:cNvSpPr>
+                              <a:spLocks/>
+                            </wps:cNvSpPr>
+                            <wps:spPr bwMode="auto">
+                              <a:xfrm>
+                                <a:off x="1216025" y="498475"/>
+                                <a:ext cx="3113088" cy="3121025"/>
+                              </a:xfrm>
+                              <a:custGeom>
+                                <a:avLst/>
+                                <a:gdLst>
+                                  <a:gd name="T0" fmla="*/ 9 w 1961"/>
+                                  <a:gd name="T1" fmla="*/ 1966 h 1966"/>
+                                  <a:gd name="T2" fmla="*/ 0 w 1961"/>
+                                  <a:gd name="T3" fmla="*/ 1957 h 1966"/>
+                                  <a:gd name="T4" fmla="*/ 1952 w 1961"/>
+                                  <a:gd name="T5" fmla="*/ 0 h 1966"/>
+                                  <a:gd name="T6" fmla="*/ 1961 w 1961"/>
+                                  <a:gd name="T7" fmla="*/ 9 h 1966"/>
+                                  <a:gd name="T8" fmla="*/ 9 w 1961"/>
+                                  <a:gd name="T9" fmla="*/ 1966 h 1966"/>
+                                </a:gdLst>
+                                <a:ahLst/>
+                                <a:cxnLst>
+                                  <a:cxn ang="0">
+                                    <a:pos x="T0" y="T1"/>
+                                  </a:cxn>
+                                  <a:cxn ang="0">
+                                    <a:pos x="T2" y="T3"/>
+                                  </a:cxn>
+                                  <a:cxn ang="0">
+                                    <a:pos x="T4" y="T5"/>
+                                  </a:cxn>
+                                  <a:cxn ang="0">
+                                    <a:pos x="T6" y="T7"/>
+                                  </a:cxn>
+                                  <a:cxn ang="0">
+                                    <a:pos x="T8" y="T9"/>
+                                  </a:cxn>
+                                </a:cxnLst>
+                                <a:rect l="0" t="0" r="r" b="b"/>
+                                <a:pathLst>
+                                  <a:path w="1961" h="1966">
+                                    <a:moveTo>
+                                      <a:pt x="9" y="1966"/>
+                                    </a:moveTo>
+                                    <a:lnTo>
+                                      <a:pt x="0" y="1957"/>
+                                    </a:lnTo>
+                                    <a:lnTo>
+                                      <a:pt x="1952" y="0"/>
+                                    </a:lnTo>
+                                    <a:lnTo>
+                                      <a:pt x="1961" y="9"/>
+                                    </a:lnTo>
+                                    <a:lnTo>
+                                      <a:pt x="9" y="1966"/>
+                                    </a:lnTo>
+                                    <a:close/>
+                                  </a:path>
+                                </a:pathLst>
+                              </a:custGeom>
+                              <a:grpFill/>
+                              <a:ln>
+                                <a:noFill/>
+                              </a:ln>
+                              <a:extLst>
+                                <a:ext uri="{91240B29-F687-4F45-9708-019B960494DF}">
+                                  <a14:hiddenLine xmlns:a14="http://schemas.microsoft.com/office/drawing/2010/main" w="9525">
+                                    <a:solidFill>
+                                      <a:srgbClr val="000000"/>
+                                    </a:solidFill>
+                                    <a:round/>
+                                    <a:headEnd/>
+                                    <a:tailEnd/>
+                                  </a14:hiddenLine>
+                                </a:ext>
+                              </a:extLst>
+                            </wps:spPr>
+                            <wps:bodyPr vert="horz" wrap="square" lIns="91440" tIns="45720" rIns="91440" bIns="45720" numCol="1" anchor="t" anchorCtr="0" compatLnSpc="1">
+                              <a:prstTxWarp prst="textNoShape">
+                                <a:avLst/>
+                              </a:prstTxWarp>
+                            </wps:bodyPr>
+                          </wps:wsp>
+                          <wps:wsp>
+                            <wps:cNvPr id="68" name="Forma libre 68"/>
+                            <wps:cNvSpPr>
+                              <a:spLocks/>
+                            </wps:cNvSpPr>
+                            <wps:spPr bwMode="auto">
+                              <a:xfrm>
+                                <a:off x="0" y="153988"/>
+                                <a:ext cx="4329113" cy="4337050"/>
+                              </a:xfrm>
+                              <a:custGeom>
+                                <a:avLst/>
+                                <a:gdLst>
+                                  <a:gd name="T0" fmla="*/ 0 w 2727"/>
+                                  <a:gd name="T1" fmla="*/ 2732 h 2732"/>
+                                  <a:gd name="T2" fmla="*/ 0 w 2727"/>
+                                  <a:gd name="T3" fmla="*/ 2728 h 2732"/>
+                                  <a:gd name="T4" fmla="*/ 2722 w 2727"/>
+                                  <a:gd name="T5" fmla="*/ 0 h 2732"/>
+                                  <a:gd name="T6" fmla="*/ 2727 w 2727"/>
+                                  <a:gd name="T7" fmla="*/ 5 h 2732"/>
+                                  <a:gd name="T8" fmla="*/ 0 w 2727"/>
+                                  <a:gd name="T9" fmla="*/ 2732 h 2732"/>
+                                </a:gdLst>
+                                <a:ahLst/>
+                                <a:cxnLst>
+                                  <a:cxn ang="0">
+                                    <a:pos x="T0" y="T1"/>
+                                  </a:cxn>
+                                  <a:cxn ang="0">
+                                    <a:pos x="T2" y="T3"/>
+                                  </a:cxn>
+                                  <a:cxn ang="0">
+                                    <a:pos x="T4" y="T5"/>
+                                  </a:cxn>
+                                  <a:cxn ang="0">
+                                    <a:pos x="T6" y="T7"/>
+                                  </a:cxn>
+                                  <a:cxn ang="0">
+                                    <a:pos x="T8" y="T9"/>
+                                  </a:cxn>
+                                </a:cxnLst>
+                                <a:rect l="0" t="0" r="r" b="b"/>
+                                <a:pathLst>
+                                  <a:path w="2727" h="2732">
+                                    <a:moveTo>
+                                      <a:pt x="0" y="2732"/>
+                                    </a:moveTo>
+                                    <a:lnTo>
+                                      <a:pt x="0" y="2728"/>
+                                    </a:lnTo>
+                                    <a:lnTo>
+                                      <a:pt x="2722" y="0"/>
+                                    </a:lnTo>
+                                    <a:lnTo>
+                                      <a:pt x="2727" y="5"/>
+                                    </a:lnTo>
+                                    <a:lnTo>
+                                      <a:pt x="0" y="2732"/>
+                                    </a:lnTo>
+                                    <a:close/>
+                                  </a:path>
+                                </a:pathLst>
+                              </a:custGeom>
+                              <a:grpFill/>
+                              <a:ln>
+                                <a:noFill/>
+                              </a:ln>
+                              <a:extLst>
+                                <a:ext uri="{91240B29-F687-4F45-9708-019B960494DF}">
+                                  <a14:hiddenLine xmlns:a14="http://schemas.microsoft.com/office/drawing/2010/main" w="9525">
+                                    <a:solidFill>
+                                      <a:srgbClr val="000000"/>
+                                    </a:solidFill>
+                                    <a:round/>
+                                    <a:headEnd/>
+                                    <a:tailEnd/>
+                                  </a14:hiddenLine>
+                                </a:ext>
+                              </a:extLst>
+                            </wps:spPr>
+                            <wps:bodyPr vert="horz" wrap="square" lIns="91440" tIns="45720" rIns="91440" bIns="45720" numCol="1" anchor="t" anchorCtr="0" compatLnSpc="1">
+                              <a:prstTxWarp prst="textNoShape">
+                                <a:avLst/>
+                              </a:prstTxWarp>
                             </wps:bodyPr>
                           </wps:wsp>
                         </wpg:wgp>
                       </a:graphicData>
                     </a:graphic>
                     <wp14:sizeRelH relativeFrom="page">
-                      <wp14:pctWidth>88200</wp14:pctWidth>
+                      <wp14:pctWidth>70600</wp14:pctWidth>
                     </wp14:sizeRelH>
                     <wp14:sizeRelV relativeFrom="page">
-                      <wp14:pctHeight>90900</wp14:pctHeight>
+                      <wp14:pctHeight>56600</wp14:pctHeight>
                     </wp14:sizeRelV>
                   </wp:anchor>
                 </w:drawing>
               </mc:Choice>
               <mc:Fallback>
                 <w:pict>
-                  <v:group w14:anchorId="23990EAD" id="Grupo 193" o:spid="_x0000_s1026" style="position:absolute;left:0;text-align:left;margin-left:0;margin-top:0;width:540.55pt;height:718.4pt;z-index:-251657216;mso-width-percent:882;mso-height-percent:909;mso-position-horizontal:center;mso-position-horizontal-relative:page;mso-position-vertical:center;mso-position-vertical-relative:page;mso-width-percent:882;mso-height-percent:909" coordsize="68648,91235" o:gfxdata="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">
-                    <v:rect id="Rectángulo 194" o:spid="_x0000_s1027" style="position:absolute;width:68580;height:13716;visibility:visible;mso-wrap-style:square;v-text-anchor:middle" o:gfxdata="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" fillcolor="#4472c4 [3204]" stroked="f" strokeweight="1pt"/>
-                    <v:rect id="Rectángulo 195" o:spid="_x0000_s1028" style="position:absolute;top:40943;width:68580;height:50292;visibility:visible;mso-wrap-style:square;v-text-anchor:bottom" o:gfxdata="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" fillcolor="#4472c4 [3204]" stroked="f" strokeweight="1pt">
-                      <v:textbox inset="36pt,57.6pt,36pt,36pt">
-                        <w:txbxContent>
-                          <w:sdt>
-                            <w:sdtPr>
-                              <w:rPr>
-                                <w:sz w:val="48"/>
-                                <w:szCs w:val="48"/>
-                              </w:rPr>
-                              <w:alias w:val="Autor"/>
-                              <w:tag w:val=""/>
-                              <w:id w:val="945428907"/>
-                              <w:dataBinding w:prefixMappings="xmlns:ns0='http://purl.org/dc/elements/1.1/' xmlns:ns1='http://schemas.openxmlformats.org/package/2006/metadata/core-properties' " w:xpath="/ns1:coreProperties[1]/ns0:creator[1]" w:storeItemID="{6C3C8BC8-F283-45AE-878A-BAB7291924A1}"/>
-                              <w:text/>
-                            </w:sdtPr>
-                            <w:sdtContent>
-                              <w:sdt>
-                                <w:sdtPr>
-                                  <w:rPr>
-                                    <w:sz w:val="48"/>
-                                    <w:szCs w:val="48"/>
-                                  </w:rPr>
-                                  <w:alias w:val="Autor"/>
-                                  <w:tag w:val=""/>
-                                  <w:id w:val="-852960315"/>
-                                  <w:dataBinding w:prefixMappings="xmlns:ns0='http://purl.org/dc/elements/1.1/' xmlns:ns1='http://schemas.openxmlformats.org/package/2006/metadata/core-properties' " w:xpath="/ns1:coreProperties[1]/ns0:creator[1]" w:storeItemID="{6C3C8BC8-F283-45AE-878A-BAB7291924A1}"/>
-                                  <w:text/>
-                                </w:sdtPr>
-                                <w:sdtContent>
-                                  <w:p>
-                                    <w:pPr>
-                                      <w:jc w:val="right"/>
-                                      <w:rPr>
-                                        <w:sz w:val="48"/>
-                                        <w:szCs w:val="48"/>
-                                      </w:rPr>
-                                    </w:pPr>
-                                    <w:r>
-                                      <w:rPr>
-                                        <w:sz w:val="48"/>
-                                        <w:szCs w:val="48"/>
-                                      </w:rPr>
-                                      <w:t>Georgii Sytnik</w:t>
-                                    </w:r>
-                                  </w:p>
-                                </w:sdtContent>
-                              </w:sdt>
-                            </w:sdtContent>
-                          </w:sdt>
-                        </w:txbxContent>
-                      </v:textbox>
-                    </v:rect>
-                    <v:shapetype id="_x0000_t202" coordsize="21600,21600" o:spt="202" path="m,l,21600r21600,l21600,xe">
-                      <v:stroke joinstyle="miter"/>
-                      <v:path gradientshapeok="t" o:connecttype="rect"/>
-                    </v:shapetype>
-                    <v:shape id="Cuadro de texto 196" o:spid="_x0000_s1029" type="#_x0000_t202" style="position:absolute;left:68;top:13716;width:68580;height:27227;visibility:visible;mso-wrap-style:square;v-text-anchor:middle" o:gfxdata="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" fillcolor="white [3212]" stroked="f" strokeweight=".5pt">
-                      <v:textbox inset="36pt,7.2pt,36pt,7.2pt">
-                        <w:txbxContent>
-                          <w:p>
-                            <w:pPr>
-                              <w:pStyle w:val="Sinespaciado"/>
-                              <w:jc w:val="center"/>
-                              <w:rPr>
-                                <w:rFonts w:asciiTheme="majorHAnsi" w:eastAsiaTheme="majorEastAsia" w:hAnsiTheme="majorHAnsi" w:cstheme="majorBidi"/>
-                                <w:caps/>
-                                <w:color w:val="4472C4" w:themeColor="accent1"/>
-                                <w:sz w:val="72"/>
-                                <w:szCs w:val="72"/>
-                              </w:rPr>
-                            </w:pPr>
-                            <w:r>
-                              <w:rPr>
-                                <w:rFonts w:asciiTheme="majorHAnsi" w:eastAsiaTheme="majorEastAsia" w:hAnsiTheme="majorHAnsi" w:cstheme="majorBidi"/>
-                                <w:caps/>
-                                <w:color w:val="4472C4" w:themeColor="accent1"/>
-                                <w:sz w:val="72"/>
-                                <w:szCs w:val="72"/>
-                              </w:rPr>
-                              <w:t>Memoria del proyecto</w:t>
-                            </w:r>
-                            <w:r>
-                              <w:rPr>
-                                <w:rFonts w:asciiTheme="majorHAnsi" w:eastAsiaTheme="majorEastAsia" w:hAnsiTheme="majorHAnsi" w:cstheme="majorBidi"/>
-                                <w:caps/>
-                                <w:color w:val="4472C4" w:themeColor="accent1"/>
-                                <w:sz w:val="72"/>
-                                <w:szCs w:val="72"/>
-                              </w:rPr>
-                              <w:t>:</w:t>
-                            </w:r>
-                          </w:p>
-                          <w:p>
-                            <w:pPr>
-                              <w:pStyle w:val="Sinespaciado"/>
-                              <w:jc w:val="center"/>
-                              <w:rPr>
-                                <w:rFonts w:asciiTheme="majorHAnsi" w:eastAsiaTheme="majorEastAsia" w:hAnsiTheme="majorHAnsi" w:cstheme="majorBidi"/>
-                                <w:caps/>
-                                <w:color w:val="4472C4" w:themeColor="accent1"/>
-                                <w:sz w:val="72"/>
-                                <w:szCs w:val="72"/>
-                              </w:rPr>
-                            </w:pPr>
-                            <w:r>
-                              <w:rPr>
-                                <w:rFonts w:asciiTheme="majorHAnsi" w:eastAsiaTheme="majorEastAsia" w:hAnsiTheme="majorHAnsi" w:cstheme="majorBidi"/>
-                                <w:caps/>
-                                <w:color w:val="4472C4" w:themeColor="accent1"/>
-                                <w:sz w:val="72"/>
-                                <w:szCs w:val="72"/>
-                              </w:rPr>
-                              <w:t xml:space="preserve">Thoth </w:t>
-                            </w:r>
-                            <w:bookmarkStart w:id="1" w:name="_GoBack"/>
-                            <w:bookmarkEnd w:id="1"/>
-                            <w:r>
-                              <w:rPr>
-                                <w:rFonts w:asciiTheme="majorHAnsi" w:eastAsiaTheme="majorEastAsia" w:hAnsiTheme="majorHAnsi" w:cstheme="majorBidi"/>
-                                <w:caps/>
-                                <w:color w:val="4472C4" w:themeColor="accent1"/>
-                                <w:sz w:val="72"/>
-                                <w:szCs w:val="72"/>
-                              </w:rPr>
-                              <w:t>tasks</w:t>
-                            </w:r>
-                          </w:p>
-                        </w:txbxContent>
-                      </v:textbox>
+                  <v:group w14:anchorId="3000C329" id="Grupo 2" o:spid="_x0000_s1026" style="position:absolute;margin-left:0;margin-top:0;width:432.65pt;height:448.55pt;z-index:-251656192;mso-width-percent:706;mso-height-percent:566;mso-left-percent:220;mso-top-percent:300;mso-position-horizontal-relative:page;mso-position-vertical-relative:page;mso-width-percent:706;mso-height-percent:566;mso-left-percent:220;mso-top-percent:300" coordsize="43291,44910" o:gfxdata="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">
+                    <o:lock v:ext="edit" aspectratio="t"/>
+                    <v:shape id="Forma libre 64" o:spid="_x0000_s1027" style="position:absolute;left:15017;width:28274;height:28352;visibility:visible;mso-wrap-style:square;v-text-anchor:top" coordsize="1781,1786" o:gfxdata="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" path="m4,1786l,1782,1776,r5,5l4,1786xe" filled="f" stroked="f">
+                      <v:path arrowok="t" o:connecttype="custom" o:connectlocs="6350,2835275;0,2828925;2819400,0;2827338,7938;6350,2835275" o:connectangles="0,0,0,0,0"/>
+                    </v:shape>
+                    <v:shape id="Forma libre 65" o:spid="_x0000_s1028" style="position:absolute;left:7826;top:2270;width:35465;height:35464;visibility:visible;mso-wrap-style:square;v-text-anchor:top" coordsize="2234,2234" o:gfxdata="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" path="m5,2234l,2229,2229,r5,5l5,2234xe" filled="f" stroked="f">
+                      <v:path arrowok="t" o:connecttype="custom" o:connectlocs="7938,3546475;0,3538538;3538538,0;3546475,7938;7938,3546475" o:connectangles="0,0,0,0,0"/>
+                    </v:shape>
+                    <v:shape id="Forma libre 66" o:spid="_x0000_s1029" style="position:absolute;left:8413;top:1095;width:34878;height:34877;visibility:visible;mso-wrap-style:square;v-text-anchor:top" coordsize="2197,2197" o:gfxdata="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" path="m9,2197l,2193,2188,r9,10l9,2197xe" filled="f" stroked="f">
+                      <v:path arrowok="t" o:connecttype="custom" o:connectlocs="14288,3487738;0,3481388;3473450,0;3487738,15875;14288,3487738" o:connectangles="0,0,0,0,0"/>
+                    </v:shape>
+                    <v:shape id="Forma libre 67" o:spid="_x0000_s1030" style="position:absolute;left:12160;top:4984;width:31131;height:31211;visibility:visible;mso-wrap-style:square;v-text-anchor:top" coordsize="1961,1966" o:gfxdata="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" path="m9,1966l,1957,1952,r9,9l9,1966xe" filled="f" stroked="f">
+                      <v:path arrowok="t" o:connecttype="custom" o:connectlocs="14288,3121025;0,3106738;3098800,0;3113088,14288;14288,3121025" o:connectangles="0,0,0,0,0"/>
+                    </v:shape>
+                    <v:shape id="Forma libre 68" o:spid="_x0000_s1031" style="position:absolute;top:1539;width:43291;height:43371;visibility:visible;mso-wrap-style:square;v-text-anchor:top" coordsize="2727,2732" o:gfxdata="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" path="m,2732r,-4l2722,r5,5l,2732xe" filled="f" stroked="f">
+                      <v:path arrowok="t" o:connecttype="custom" o:connectlocs="0,4337050;0,4330700;4321175,0;4329113,7938;0,4337050" o:connectangles="0,0,0,0,0"/>
                     </v:shape>
                     <w10:wrap anchorx="page" anchory="page"/>
                   </v:group>
@@ -459,56 +859,259 @@
           </w:r>
           <w:r>
             <w:rPr>
-              <w:color w:val="FFFFFF" w:themeColor="background1"/>
-              <w:sz w:val="36"/>
-              <w:szCs w:val="36"/>
+              <w:noProof/>
             </w:rPr>
-            <w:t>PROYECTO INTERMODULAR</w:t>
+            <mc:AlternateContent>
+              <mc:Choice Requires="wps">
+                <w:drawing>
+                  <wp:anchor distT="0" distB="0" distL="114300" distR="114300" simplePos="0" relativeHeight="251659264" behindDoc="0" locked="0" layoutInCell="1" allowOverlap="1" wp14:anchorId="51FD71DE" wp14:editId="0306390E">
+                    <wp:simplePos x="0" y="0"/>
+                    <wp:positionH relativeFrom="page">
+                      <wp:align>center</wp:align>
+                    </wp:positionH>
+                    <wp:positionV relativeFrom="margin">
+                      <wp:align>bottom</wp:align>
+                    </wp:positionV>
+                    <wp:extent cx="5943600" cy="374904"/>
+                    <wp:effectExtent l="0" t="0" r="0" b="2540"/>
+                    <wp:wrapNone/>
+                    <wp:docPr id="69" name="Cuadro de texto 69"/>
+                    <wp:cNvGraphicFramePr/>
+                    <a:graphic xmlns:a="http://schemas.openxmlformats.org/drawingml/2006/main">
+                      <a:graphicData uri="http://schemas.microsoft.com/office/word/2010/wordprocessingShape">
+                        <wps:wsp>
+                          <wps:cNvSpPr txBox="1"/>
+                          <wps:spPr>
+                            <a:xfrm>
+                              <a:off x="0" y="0"/>
+                              <a:ext cx="5943600" cy="374904"/>
+                            </a:xfrm>
+                            <a:prstGeom prst="rect">
+                              <a:avLst/>
+                            </a:prstGeom>
+                            <a:noFill/>
+                            <a:ln w="6350">
+                              <a:noFill/>
+                            </a:ln>
+                            <a:effectLst/>
+                          </wps:spPr>
+                          <wps:style>
+                            <a:lnRef idx="0">
+                              <a:schemeClr val="accent1"/>
+                            </a:lnRef>
+                            <a:fillRef idx="0">
+                              <a:schemeClr val="accent1"/>
+                            </a:fillRef>
+                            <a:effectRef idx="0">
+                              <a:schemeClr val="accent1"/>
+                            </a:effectRef>
+                            <a:fontRef idx="minor">
+                              <a:schemeClr val="dk1"/>
+                            </a:fontRef>
+                          </wps:style>
+                          <wps:txbx>
+                            <w:txbxContent>
+                              <w:p>
+                                <w:pPr>
+                                  <w:pStyle w:val="Sinespaciado"/>
+                                  <w:jc w:val="right"/>
+                                  <w:rPr>
+                                    <w:color w:val="4472C4" w:themeColor="accent1"/>
+                                    <w:sz w:val="36"/>
+                                    <w:szCs w:val="36"/>
+                                  </w:rPr>
+                                </w:pPr>
+                                <w:sdt>
+                                  <w:sdtPr>
+                                    <w:rPr>
+                                      <w:color w:val="4472C4" w:themeColor="accent1"/>
+                                      <w:sz w:val="36"/>
+                                      <w:szCs w:val="36"/>
+                                    </w:rPr>
+                                    <w:alias w:val="Escolar"/>
+                                    <w:tag w:val="Escolar"/>
+                                    <w:id w:val="1850680582"/>
+                                    <w:dataBinding w:prefixMappings="xmlns:ns0='http://schemas.openxmlformats.org/officeDocument/2006/extended-properties' " w:xpath="/ns0:Properties[1]/ns0:Company[1]" w:storeItemID="{6668398D-A668-4E3E-A5EB-62B293D839F1}"/>
+                                    <w:text/>
+                                  </w:sdtPr>
+                                  <w:sdtEndPr/>
+                                  <w:sdtContent>
+                                    <w:r>
+                                      <w:rPr>
+                                        <w:color w:val="4472C4" w:themeColor="accent1"/>
+                                        <w:sz w:val="36"/>
+                                        <w:szCs w:val="36"/>
+                                      </w:rPr>
+                                      <w:t>Georgii Sytnik</w:t>
+                                    </w:r>
+                                  </w:sdtContent>
+                                </w:sdt>
+                              </w:p>
+                              <w:sdt>
+                                <w:sdtPr>
+                                  <w:rPr>
+                                    <w:color w:val="4472C4" w:themeColor="accent1"/>
+                                    <w:sz w:val="36"/>
+                                    <w:szCs w:val="36"/>
+                                  </w:rPr>
+                                  <w:alias w:val="Curso"/>
+                                  <w:tag w:val="Curso"/>
+                                  <w:id w:val="1717703537"/>
+                                  <w:dataBinding w:prefixMappings="xmlns:ns0='http://purl.org/dc/elements/1.1/' xmlns:ns1='http://schemas.openxmlformats.org/package/2006/metadata/core-properties' " w:xpath="/ns1:coreProperties[1]/ns1:category[1]" w:storeItemID="{6C3C8BC8-F283-45AE-878A-BAB7291924A1}"/>
+                                  <w:text/>
+                                </w:sdtPr>
+                                <w:sdtEndPr/>
+                                <w:sdtContent>
+                                  <w:p>
+                                    <w:pPr>
+                                      <w:pStyle w:val="Sinespaciado"/>
+                                      <w:jc w:val="right"/>
+                                      <w:rPr>
+                                        <w:color w:val="4472C4" w:themeColor="accent1"/>
+                                        <w:sz w:val="36"/>
+                                        <w:szCs w:val="36"/>
+                                      </w:rPr>
+                                    </w:pPr>
+                                    <w:r>
+                                      <w:rPr>
+                                        <w:color w:val="4472C4" w:themeColor="accent1"/>
+                                        <w:sz w:val="36"/>
+                                        <w:szCs w:val="36"/>
+                                      </w:rPr>
+                                      <w:t>DAM 2 DIA</w:t>
+                                    </w:r>
+                                  </w:p>
+                                </w:sdtContent>
+                              </w:sdt>
+                            </w:txbxContent>
+                          </wps:txbx>
+                          <wps:bodyPr rot="0" spcFirstLastPara="0" vertOverflow="overflow" horzOverflow="overflow" vert="horz" wrap="square" lIns="0" tIns="0" rIns="0" bIns="0" numCol="1" spcCol="0" rtlCol="0" fromWordArt="0" anchor="b" anchorCtr="0" forceAA="0" compatLnSpc="1">
+                            <a:prstTxWarp prst="textNoShape">
+                              <a:avLst/>
+                            </a:prstTxWarp>
+                            <a:spAutoFit/>
+                          </wps:bodyPr>
+                        </wps:wsp>
+                      </a:graphicData>
+                    </a:graphic>
+                    <wp14:sizeRelH relativeFrom="page">
+                      <wp14:pctWidth>76500</wp14:pctWidth>
+                    </wp14:sizeRelH>
+                    <wp14:sizeRelV relativeFrom="margin">
+                      <wp14:pctHeight>0</wp14:pctHeight>
+                    </wp14:sizeRelV>
+                  </wp:anchor>
+                </w:drawing>
+              </mc:Choice>
+              <mc:Fallback>
+                <w:pict>
+                  <v:shape w14:anchorId="51FD71DE" id="Cuadro de texto 69" o:spid="_x0000_s1027" type="#_x0000_t202" style="position:absolute;left:0;text-align:left;margin-left:0;margin-top:0;width:468pt;height:29.5pt;z-index:251659264;visibility:visible;mso-wrap-style:square;mso-width-percent:765;mso-height-percent:0;mso-wrap-distance-left:9pt;mso-wrap-distance-top:0;mso-wrap-distance-right:9pt;mso-wrap-distance-bottom:0;mso-position-horizontal:center;mso-position-horizontal-relative:page;mso-position-vertical:bottom;mso-position-vertical-relative:margin;mso-width-percent:765;mso-height-percent:0;mso-width-relative:page;mso-height-relative:margin;v-text-anchor:bottom" o:gfxdata="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" filled="f" stroked="f" strokeweight=".5pt">
+                    <v:textbox style="mso-fit-shape-to-text:t" inset="0,0,0,0">
+                      <w:txbxContent>
+                        <w:p>
+                          <w:pPr>
+                            <w:pStyle w:val="Sinespaciado"/>
+                            <w:jc w:val="right"/>
+                            <w:rPr>
+                              <w:color w:val="4472C4" w:themeColor="accent1"/>
+                              <w:sz w:val="36"/>
+                              <w:szCs w:val="36"/>
+                            </w:rPr>
+                          </w:pPr>
+                          <w:sdt>
+                            <w:sdtPr>
+                              <w:rPr>
+                                <w:color w:val="4472C4" w:themeColor="accent1"/>
+                                <w:sz w:val="36"/>
+                                <w:szCs w:val="36"/>
+                              </w:rPr>
+                              <w:alias w:val="Escolar"/>
+                              <w:tag w:val="Escolar"/>
+                              <w:id w:val="1850680582"/>
+                              <w:dataBinding w:prefixMappings="xmlns:ns0='http://schemas.openxmlformats.org/officeDocument/2006/extended-properties' " w:xpath="/ns0:Properties[1]/ns0:Company[1]" w:storeItemID="{6668398D-A668-4E3E-A5EB-62B293D839F1}"/>
+                              <w:text/>
+                            </w:sdtPr>
+                            <w:sdtEndPr/>
+                            <w:sdtContent>
+                              <w:r>
+                                <w:rPr>
+                                  <w:color w:val="4472C4" w:themeColor="accent1"/>
+                                  <w:sz w:val="36"/>
+                                  <w:szCs w:val="36"/>
+                                </w:rPr>
+                                <w:t>Georgii Sytnik</w:t>
+                              </w:r>
+                            </w:sdtContent>
+                          </w:sdt>
+                        </w:p>
+                        <w:sdt>
+                          <w:sdtPr>
+                            <w:rPr>
+                              <w:color w:val="4472C4" w:themeColor="accent1"/>
+                              <w:sz w:val="36"/>
+                              <w:szCs w:val="36"/>
+                            </w:rPr>
+                            <w:alias w:val="Curso"/>
+                            <w:tag w:val="Curso"/>
+                            <w:id w:val="1717703537"/>
+                            <w:dataBinding w:prefixMappings="xmlns:ns0='http://purl.org/dc/elements/1.1/' xmlns:ns1='http://schemas.openxmlformats.org/package/2006/metadata/core-properties' " w:xpath="/ns1:coreProperties[1]/ns1:category[1]" w:storeItemID="{6C3C8BC8-F283-45AE-878A-BAB7291924A1}"/>
+                            <w:text/>
+                          </w:sdtPr>
+                          <w:sdtEndPr/>
+                          <w:sdtContent>
+                            <w:p>
+                              <w:pPr>
+                                <w:pStyle w:val="Sinespaciado"/>
+                                <w:jc w:val="right"/>
+                                <w:rPr>
+                                  <w:color w:val="4472C4" w:themeColor="accent1"/>
+                                  <w:sz w:val="36"/>
+                                  <w:szCs w:val="36"/>
+                                </w:rPr>
+                              </w:pPr>
+                              <w:r>
+                                <w:rPr>
+                                  <w:color w:val="4472C4" w:themeColor="accent1"/>
+                                  <w:sz w:val="36"/>
+                                  <w:szCs w:val="36"/>
+                                </w:rPr>
+                                <w:t>DAM 2 DIA</w:t>
+                              </w:r>
+                            </w:p>
+                          </w:sdtContent>
+                        </w:sdt>
+                      </w:txbxContent>
+                    </v:textbox>
+                    <w10:wrap anchorx="page" anchory="margin"/>
+                  </v:shape>
+                </w:pict>
+              </mc:Fallback>
+            </mc:AlternateContent>
           </w:r>
         </w:p>
         <w:p>
-          <w:pPr>
-            <w:tabs>
-              <w:tab w:val="left" w:pos="3735"/>
-              <w:tab w:val="left" w:pos="7065"/>
-              <w:tab w:val="left" w:pos="7635"/>
-              <w:tab w:val="right" w:pos="8504"/>
-            </w:tabs>
-            <w:jc w:val="right"/>
-            <w:rPr>
-              <w:color w:val="FFFFFF" w:themeColor="background1"/>
-              <w:sz w:val="36"/>
-              <w:szCs w:val="36"/>
-            </w:rPr>
-          </w:pPr>
-          <w:r>
-            <w:rPr>
-              <w:color w:val="FFFFFF" w:themeColor="background1"/>
-              <w:sz w:val="36"/>
-              <w:szCs w:val="36"/>
-            </w:rPr>
-            <w:t>DAM 2 DIA</w:t>
-          </w:r>
-        </w:p>
-        <w:p>
-          <w:pPr>
-            <w:tabs>
-              <w:tab w:val="right" w:pos="8504"/>
-            </w:tabs>
-            <w:spacing w:before="0" w:after="160" w:line="259" w:lineRule="auto"/>
-            <w:jc w:val="left"/>
-          </w:pPr>
           <w:r>
             <w:br w:type="page"/>
-          </w:r>
-          <w:r>
-            <w:lastRenderedPageBreak/>
-            <w:tab/>
           </w:r>
         </w:p>
       </w:sdtContent>
     </w:sdt>
-    <w:p/>
+    <w:p>
+      <w:r>
+        <w:lastRenderedPageBreak/>
+        <w:t xml:space="preserve">Se ha optado por una metodología híbrida combinando un enfoque tradicional en la fase inicial del proyecto para establecer una base sólida y documentada del sistema, seguida de una metodología ágil basada en Scrum para la evolución incremental del producto mediante </w:t>
+      </w:r>
+      <w:proofErr w:type="spellStart"/>
+      <w:r>
+        <w:t>sprints</w:t>
+      </w:r>
+      <w:proofErr w:type="spellEnd"/>
+      <w:r>
+        <w:t xml:space="preserve"> de desarrollo.</w:t>
+      </w:r>
+      <w:bookmarkStart w:id="0" w:name="_GoBack"/>
+      <w:bookmarkEnd w:id="0"/>
+    </w:p>
     <w:sectPr>
       <w:footerReference w:type="default" r:id="rId7"/>
       <w:pgSz w:w="11906" w:h="16838"/>
@@ -527,7 +1130,7 @@
   <w:endnote w:type="separator" w:id="-1">
     <w:p>
       <w:pPr>
-        <w:spacing w:before="0" w:after="0"/>
+        <w:spacing w:after="0"/>
       </w:pPr>
       <w:r>
         <w:separator/>
@@ -537,7 +1140,7 @@
   <w:endnote w:type="continuationSeparator" w:id="0">
     <w:p>
       <w:pPr>
-        <w:spacing w:before="0" w:after="0"/>
+        <w:spacing w:after="0"/>
       </w:pPr>
       <w:r>
         <w:continuationSeparator/>
@@ -668,7 +1271,7 @@
   <w:footnote w:type="separator" w:id="-1">
     <w:p>
       <w:pPr>
-        <w:spacing w:before="0" w:after="0"/>
+        <w:spacing w:after="0"/>
       </w:pPr>
       <w:r>
         <w:separator/>
@@ -678,7 +1281,7 @@
   <w:footnote w:type="continuationSeparator" w:id="0">
     <w:p>
       <w:pPr>
-        <w:spacing w:before="0" w:after="0"/>
+        <w:spacing w:after="0"/>
       </w:pPr>
       <w:r>
         <w:continuationSeparator/>
@@ -1085,7 +1688,7 @@
   <w:style w:type="paragraph" w:default="1" w:styleId="Normal">
     <w:name w:val="Normal"/>
     <w:qFormat/>
-    <w:rsid w:val="00415387"/>
+    <w:rsid w:val="00AA2792"/>
     <w:pPr>
       <w:spacing w:before="240" w:after="240" w:line="240" w:lineRule="auto"/>
       <w:jc w:val="both"/>
@@ -1126,7 +1729,7 @@
     <w:link w:val="SinespaciadoCar"/>
     <w:uiPriority w:val="1"/>
     <w:qFormat/>
-    <w:rsid w:val="00211DCE"/>
+    <w:rsid w:val="00466A55"/>
     <w:pPr>
       <w:spacing w:after="0" w:line="240" w:lineRule="auto"/>
     </w:pPr>
@@ -1140,7 +1743,7 @@
     <w:basedOn w:val="Fuentedeprrafopredeter"/>
     <w:link w:val="Sinespaciado"/>
     <w:uiPriority w:val="1"/>
-    <w:rsid w:val="00211DCE"/>
+    <w:rsid w:val="00466A55"/>
     <w:rPr>
       <w:rFonts w:eastAsiaTheme="minorEastAsia"/>
       <w:lang w:eastAsia="es-ES"/>
@@ -1152,13 +1755,13 @@
     <w:link w:val="EncabezadoCar"/>
     <w:uiPriority w:val="99"/>
     <w:unhideWhenUsed/>
-    <w:rsid w:val="00211DCE"/>
+    <w:rsid w:val="00466A55"/>
     <w:pPr>
       <w:tabs>
         <w:tab w:val="center" w:pos="4252"/>
         <w:tab w:val="right" w:pos="8504"/>
       </w:tabs>
-      <w:spacing w:before="0" w:after="0"/>
+      <w:spacing w:after="0"/>
     </w:pPr>
   </w:style>
   <w:style w:type="character" w:customStyle="1" w:styleId="EncabezadoCar">
@@ -1166,10 +1769,7 @@
     <w:basedOn w:val="Fuentedeprrafopredeter"/>
     <w:link w:val="Encabezado"/>
     <w:uiPriority w:val="99"/>
-    <w:rsid w:val="00211DCE"/>
-    <w:rPr>
-      <w:sz w:val="24"/>
-    </w:rPr>
+    <w:rsid w:val="00466A55"/>
   </w:style>
   <w:style w:type="paragraph" w:styleId="Piedepgina">
     <w:name w:val="footer"/>
@@ -1177,13 +1777,13 @@
     <w:link w:val="PiedepginaCar"/>
     <w:uiPriority w:val="99"/>
     <w:unhideWhenUsed/>
-    <w:rsid w:val="00211DCE"/>
+    <w:rsid w:val="00466A55"/>
     <w:pPr>
       <w:tabs>
         <w:tab w:val="center" w:pos="4252"/>
         <w:tab w:val="right" w:pos="8504"/>
       </w:tabs>
-      <w:spacing w:before="0" w:after="0"/>
+      <w:spacing w:after="0"/>
     </w:pPr>
   </w:style>
   <w:style w:type="character" w:customStyle="1" w:styleId="PiedepginaCar">
@@ -1191,10 +1791,7 @@
     <w:basedOn w:val="Fuentedeprrafopredeter"/>
     <w:link w:val="Piedepgina"/>
     <w:uiPriority w:val="99"/>
-    <w:rsid w:val="00211DCE"/>
-    <w:rPr>
-      <w:sz w:val="24"/>
-    </w:rPr>
+    <w:rsid w:val="00466A55"/>
   </w:style>
 </w:styles>
 </file>
@@ -1499,7 +2096,7 @@
 </file>
 
 <file path=customXml/itemProps1.xml><?xml version="1.0" encoding="utf-8"?>
-<ds:datastoreItem xmlns:ds="http://schemas.openxmlformats.org/officeDocument/2006/customXml" ds:itemID="{556DF14C-6DB5-4D58-8D48-21F1529EAFDF}">
+<ds:datastoreItem xmlns:ds="http://schemas.openxmlformats.org/officeDocument/2006/customXml" ds:itemID="{55A8E7D2-C4E0-4CAB-ACD8-BC3C4AF4033E}">
   <ds:schemaRefs>
     <ds:schemaRef ds:uri="http://schemas.openxmlformats.org/officeDocument/2006/bibliography"/>
   </ds:schemaRefs>

</xml_diff>